<commit_message>
Web Application Project Creation
</commit_message>
<xml_diff>
--- a/Part 1/ST10493664_CLDV6211_Part1.docx
+++ b/Part 1/ST10493664_CLDV6211_Part1.docx
@@ -4,13 +4,6 @@
   <w:body>
     <w:sdt>
       <w:sdtPr>
-        <w:id w:val="-328982621"/>
-        <w:docPartObj>
-          <w:docPartGallery w:val="Cover Pages"/>
-          <w:docPartUnique/>
-        </w:docPartObj>
-      </w:sdtPr>
-      <w:sdtEndPr>
         <w:rPr>
           <w:rFonts w:ascii="Calibri" w:eastAsiaTheme="minorHAnsi" w:hAnsi="Calibri"/>
           <w:kern w:val="2"/>
@@ -18,7 +11,13 @@
           <w:lang w:val="en-ZA"/>
           <w14:ligatures w14:val="standardContextual"/>
         </w:rPr>
-      </w:sdtEndPr>
+        <w:id w:val="-328982621"/>
+        <w:docPartObj>
+          <w:docPartGallery w:val="Cover Pages"/>
+          <w:docPartUnique/>
+        </w:docPartObj>
+      </w:sdtPr>
+      <w:sdtEndPr/>
       <w:sdtContent>
         <w:p>
           <w:pPr>
@@ -3765,6 +3764,7 @@
                                     <w:dataBinding w:prefixMappings="xmlns:ns0='http://purl.org/dc/elements/1.1/' xmlns:ns1='http://schemas.openxmlformats.org/package/2006/metadata/core-properties' " w:xpath="/ns1:coreProperties[1]/ns0:title[1]" w:storeItemID="{6C3C8BC8-F283-45AE-878A-BAB7291924A1}"/>
                                     <w:text/>
                                   </w:sdtPr>
+                                  <w:sdtEndPr/>
                                   <w:sdtContent>
                                     <w:r>
                                       <w:rPr>
@@ -3800,6 +3800,7 @@
                                     <w:dataBinding w:prefixMappings="xmlns:ns0='http://purl.org/dc/elements/1.1/' xmlns:ns1='http://schemas.openxmlformats.org/package/2006/metadata/core-properties' " w:xpath="/ns1:coreProperties[1]/ns0:subject[1]" w:storeItemID="{6C3C8BC8-F283-45AE-878A-BAB7291924A1}"/>
                                     <w:text/>
                                   </w:sdtPr>
+                                  <w:sdtEndPr/>
                                   <w:sdtContent>
                                     <w:r>
                                       <w:rPr>
@@ -3860,6 +3861,7 @@
                               <w:dataBinding w:prefixMappings="xmlns:ns0='http://purl.org/dc/elements/1.1/' xmlns:ns1='http://schemas.openxmlformats.org/package/2006/metadata/core-properties' " w:xpath="/ns1:coreProperties[1]/ns0:title[1]" w:storeItemID="{6C3C8BC8-F283-45AE-878A-BAB7291924A1}"/>
                               <w:text/>
                             </w:sdtPr>
+                            <w:sdtEndPr/>
                             <w:sdtContent>
                               <w:r>
                                 <w:rPr>
@@ -3895,6 +3897,7 @@
                               <w:dataBinding w:prefixMappings="xmlns:ns0='http://purl.org/dc/elements/1.1/' xmlns:ns1='http://schemas.openxmlformats.org/package/2006/metadata/core-properties' " w:xpath="/ns1:coreProperties[1]/ns0:subject[1]" w:storeItemID="{6C3C8BC8-F283-45AE-878A-BAB7291924A1}"/>
                               <w:text/>
                             </w:sdtPr>
+                            <w:sdtEndPr/>
                             <w:sdtContent>
                               <w:r>
                                 <w:rPr>
@@ -4041,6 +4044,16 @@
     </w:sdt>
     <w:sdt>
       <w:sdtPr>
+        <w:rPr>
+          <w:rFonts w:ascii="Calibri" w:eastAsiaTheme="minorHAnsi" w:hAnsi="Calibri" w:cstheme="minorBidi"/>
+          <w:color w:val="auto"/>
+          <w:kern w:val="2"/>
+          <w:sz w:val="22"/>
+          <w:szCs w:val="24"/>
+          <w:u w:val="none"/>
+          <w:lang w:val="en-ZA"/>
+          <w14:ligatures w14:val="standardContextual"/>
+        </w:rPr>
         <w:id w:val="643703018"/>
         <w:docPartObj>
           <w:docPartGallery w:val="Table of Contents"/>
@@ -4049,17 +4062,9 @@
       </w:sdtPr>
       <w:sdtEndPr>
         <w:rPr>
-          <w:rFonts w:ascii="Calibri" w:eastAsiaTheme="minorHAnsi" w:hAnsi="Calibri" w:cstheme="minorBidi"/>
           <w:b/>
           <w:bCs/>
           <w:noProof/>
-          <w:color w:val="auto"/>
-          <w:kern w:val="2"/>
-          <w:sz w:val="22"/>
-          <w:szCs w:val="24"/>
-          <w:u w:val="none"/>
-          <w:lang w:val="en-ZA"/>
-          <w14:ligatures w14:val="standardContextual"/>
         </w:rPr>
       </w:sdtEndPr>
       <w:sdtContent>
@@ -4068,7 +4073,10 @@
             <w:pStyle w:val="TOCHeading"/>
           </w:pPr>
           <w:r>
-            <w:t>Contents</w:t>
+            <w:t>Table of C</w:t>
+          </w:r>
+          <w:r>
+            <w:t>ontents</w:t>
           </w:r>
         </w:p>
         <w:p>
@@ -4078,7 +4086,10 @@
               <w:tab w:val="right" w:leader="dot" w:pos="9016"/>
             </w:tabs>
             <w:rPr>
+              <w:rFonts w:asciiTheme="minorHAnsi" w:eastAsiaTheme="minorEastAsia" w:hAnsiTheme="minorHAnsi"/>
               <w:noProof/>
+              <w:sz w:val="24"/>
+              <w:lang w:eastAsia="en-ZA"/>
             </w:rPr>
           </w:pPr>
           <w:r>
@@ -4090,13 +4101,13 @@
           <w:r>
             <w:fldChar w:fldCharType="separate"/>
           </w:r>
-          <w:hyperlink w:anchor="_Toc224065636" w:history="1">
+          <w:hyperlink w:anchor="_Toc224065957" w:history="1">
             <w:r>
               <w:rPr>
                 <w:rStyle w:val="Hyperlink"/>
                 <w:noProof/>
               </w:rPr>
-              <w:t>Theoretical Questions</w:t>
+              <w:t>Part 1A</w:t>
             </w:r>
             <w:r>
               <w:rPr>
@@ -4117,7 +4128,7 @@
                 <w:noProof/>
                 <w:webHidden/>
               </w:rPr>
-              <w:instrText xml:space="preserve"> PAGEREF _Toc224065636 \h </w:instrText>
+              <w:instrText xml:space="preserve"> PAGEREF _Toc224065957 \h </w:instrText>
             </w:r>
             <w:r>
               <w:rPr>
@@ -4155,16 +4166,19 @@
               <w:tab w:val="right" w:leader="dot" w:pos="9016"/>
             </w:tabs>
             <w:rPr>
+              <w:rFonts w:asciiTheme="minorHAnsi" w:eastAsiaTheme="minorEastAsia" w:hAnsiTheme="minorHAnsi"/>
               <w:noProof/>
+              <w:sz w:val="24"/>
+              <w:lang w:eastAsia="en-ZA"/>
             </w:rPr>
           </w:pPr>
-          <w:hyperlink w:anchor="_Toc224065637" w:history="1">
+          <w:hyperlink w:anchor="_Toc224065958" w:history="1">
             <w:r>
               <w:rPr>
                 <w:rStyle w:val="Hyperlink"/>
                 <w:noProof/>
               </w:rPr>
-              <w:t>Part 1A</w:t>
+              <w:t>Part 1B</w:t>
             </w:r>
             <w:r>
               <w:rPr>
@@ -4185,7 +4199,7 @@
                 <w:noProof/>
                 <w:webHidden/>
               </w:rPr>
-              <w:instrText xml:space="preserve"> PAGEREF _Toc224065637 \h </w:instrText>
+              <w:instrText xml:space="preserve"> PAGEREF _Toc224065958 \h </w:instrText>
             </w:r>
             <w:r>
               <w:rPr>
@@ -4223,16 +4237,19 @@
               <w:tab w:val="right" w:leader="dot" w:pos="9016"/>
             </w:tabs>
             <w:rPr>
+              <w:rFonts w:asciiTheme="minorHAnsi" w:eastAsiaTheme="minorEastAsia" w:hAnsiTheme="minorHAnsi"/>
               <w:noProof/>
+              <w:sz w:val="24"/>
+              <w:lang w:eastAsia="en-ZA"/>
             </w:rPr>
           </w:pPr>
-          <w:hyperlink w:anchor="_Toc224065638" w:history="1">
+          <w:hyperlink w:anchor="_Toc224065959" w:history="1">
             <w:r>
               <w:rPr>
                 <w:rStyle w:val="Hyperlink"/>
                 <w:noProof/>
               </w:rPr>
-              <w:t>Part 1B</w:t>
+              <w:t>Part 1C</w:t>
             </w:r>
             <w:r>
               <w:rPr>
@@ -4253,7 +4270,7 @@
                 <w:noProof/>
                 <w:webHidden/>
               </w:rPr>
-              <w:instrText xml:space="preserve"> PAGEREF _Toc224065638 \h </w:instrText>
+              <w:instrText xml:space="preserve"> PAGEREF _Toc224065959 \h </w:instrText>
             </w:r>
             <w:r>
               <w:rPr>
@@ -4291,16 +4308,19 @@
               <w:tab w:val="right" w:leader="dot" w:pos="9016"/>
             </w:tabs>
             <w:rPr>
+              <w:rFonts w:asciiTheme="minorHAnsi" w:eastAsiaTheme="minorEastAsia" w:hAnsiTheme="minorHAnsi"/>
               <w:noProof/>
+              <w:sz w:val="24"/>
+              <w:lang w:eastAsia="en-ZA"/>
             </w:rPr>
           </w:pPr>
-          <w:hyperlink w:anchor="_Toc224065639" w:history="1">
+          <w:hyperlink w:anchor="_Toc224065960" w:history="1">
             <w:r>
               <w:rPr>
                 <w:rStyle w:val="Hyperlink"/>
                 <w:noProof/>
               </w:rPr>
-              <w:t>Part 1C</w:t>
+              <w:t>Part 1D</w:t>
             </w:r>
             <w:r>
               <w:rPr>
@@ -4321,7 +4341,7 @@
                 <w:noProof/>
                 <w:webHidden/>
               </w:rPr>
-              <w:instrText xml:space="preserve"> PAGEREF _Toc224065639 \h </w:instrText>
+              <w:instrText xml:space="preserve"> PAGEREF _Toc224065960 \h </w:instrText>
             </w:r>
             <w:r>
               <w:rPr>
@@ -4359,78 +4379,13 @@
               <w:tab w:val="right" w:leader="dot" w:pos="9016"/>
             </w:tabs>
             <w:rPr>
+              <w:rFonts w:asciiTheme="minorHAnsi" w:eastAsiaTheme="minorEastAsia" w:hAnsiTheme="minorHAnsi"/>
               <w:noProof/>
+              <w:sz w:val="24"/>
+              <w:lang w:eastAsia="en-ZA"/>
             </w:rPr>
           </w:pPr>
-          <w:hyperlink w:anchor="_Toc224065640" w:history="1">
-            <w:r>
-              <w:rPr>
-                <w:rStyle w:val="Hyperlink"/>
-                <w:noProof/>
-              </w:rPr>
-              <w:t>Part 1D</w:t>
-            </w:r>
-            <w:r>
-              <w:rPr>
-                <w:noProof/>
-                <w:webHidden/>
-              </w:rPr>
-              <w:tab/>
-            </w:r>
-            <w:r>
-              <w:rPr>
-                <w:noProof/>
-                <w:webHidden/>
-              </w:rPr>
-              <w:fldChar w:fldCharType="begin"/>
-            </w:r>
-            <w:r>
-              <w:rPr>
-                <w:noProof/>
-                <w:webHidden/>
-              </w:rPr>
-              <w:instrText xml:space="preserve"> PAGEREF _Toc224065640 \h </w:instrText>
-            </w:r>
-            <w:r>
-              <w:rPr>
-                <w:noProof/>
-                <w:webHidden/>
-              </w:rPr>
-            </w:r>
-            <w:r>
-              <w:rPr>
-                <w:noProof/>
-                <w:webHidden/>
-              </w:rPr>
-              <w:fldChar w:fldCharType="separate"/>
-            </w:r>
-            <w:r>
-              <w:rPr>
-                <w:noProof/>
-                <w:webHidden/>
-              </w:rPr>
-              <w:t>2</w:t>
-            </w:r>
-            <w:r>
-              <w:rPr>
-                <w:noProof/>
-                <w:webHidden/>
-              </w:rPr>
-              <w:fldChar w:fldCharType="end"/>
-            </w:r>
-          </w:hyperlink>
-        </w:p>
-        <w:p>
-          <w:pPr>
-            <w:pStyle w:val="TOC1"/>
-            <w:tabs>
-              <w:tab w:val="right" w:leader="dot" w:pos="9016"/>
-            </w:tabs>
-            <w:rPr>
-              <w:noProof/>
-            </w:rPr>
-          </w:pPr>
-          <w:hyperlink w:anchor="_Toc224065641" w:history="1">
+          <w:hyperlink w:anchor="_Toc224065961" w:history="1">
             <w:r>
               <w:rPr>
                 <w:rStyle w:val="Hyperlink"/>
@@ -4457,7 +4412,7 @@
                 <w:noProof/>
                 <w:webHidden/>
               </w:rPr>
-              <w:instrText xml:space="preserve"> PAGEREF _Toc224065641 \h </w:instrText>
+              <w:instrText xml:space="preserve"> PAGEREF _Toc224065961 \h </w:instrText>
             </w:r>
             <w:r>
               <w:rPr>
@@ -4510,10 +4465,10 @@
       <w:pPr>
         <w:pStyle w:val="Heading1"/>
       </w:pPr>
-      <w:bookmarkStart w:id="0" w:name="_Toc224065636"/>
+      <w:bookmarkStart w:id="0" w:name="_Toc224065957"/>
       <w:r>
         <w:lastRenderedPageBreak/>
-        <w:t>Theoretical Questions</w:t>
+        <w:t>Part 1A</w:t>
       </w:r>
       <w:bookmarkEnd w:id="0"/>
     </w:p>
@@ -4521,9 +4476,9 @@
       <w:pPr>
         <w:pStyle w:val="Heading1"/>
       </w:pPr>
-      <w:bookmarkStart w:id="1" w:name="_Toc224065637"/>
+      <w:bookmarkStart w:id="1" w:name="_Toc224065958"/>
       <w:r>
-        <w:t>Part 1A</w:t>
+        <w:t>Part 1B</w:t>
       </w:r>
       <w:bookmarkEnd w:id="1"/>
     </w:p>
@@ -4531,12 +4486,9 @@
       <w:pPr>
         <w:pStyle w:val="Heading1"/>
       </w:pPr>
-      <w:bookmarkStart w:id="2" w:name="_Toc224065638"/>
+      <w:bookmarkStart w:id="2" w:name="_Toc224065959"/>
       <w:r>
-        <w:t>Part 1</w:t>
-      </w:r>
-      <w:r>
-        <w:t>B</w:t>
+        <w:t>Part 1C</w:t>
       </w:r>
       <w:bookmarkEnd w:id="2"/>
     </w:p>
@@ -4544,12 +4496,9 @@
       <w:pPr>
         <w:pStyle w:val="Heading1"/>
       </w:pPr>
-      <w:bookmarkStart w:id="3" w:name="_Toc224065639"/>
+      <w:bookmarkStart w:id="3" w:name="_Toc224065960"/>
       <w:r>
-        <w:t>Part 1</w:t>
-      </w:r>
-      <w:r>
-        <w:t>C</w:t>
+        <w:t>Part 1D</w:t>
       </w:r>
       <w:bookmarkEnd w:id="3"/>
     </w:p>
@@ -4557,24 +4506,11 @@
       <w:pPr>
         <w:pStyle w:val="Heading1"/>
       </w:pPr>
-      <w:bookmarkStart w:id="4" w:name="_Toc224065640"/>
-      <w:r>
-        <w:t>Part 1</w:t>
-      </w:r>
-      <w:r>
-        <w:t>D</w:t>
-      </w:r>
-      <w:bookmarkEnd w:id="4"/>
-    </w:p>
-    <w:p>
-      <w:pPr>
-        <w:pStyle w:val="Heading1"/>
-      </w:pPr>
-      <w:bookmarkStart w:id="5" w:name="_Toc224065641"/>
+      <w:bookmarkStart w:id="4" w:name="_Toc224065961"/>
       <w:r>
         <w:t>References</w:t>
       </w:r>
-      <w:bookmarkEnd w:id="5"/>
+      <w:bookmarkEnd w:id="4"/>
     </w:p>
     <w:sectPr>
       <w:footerReference w:type="default" r:id="rId7"/>

</xml_diff>